<commit_message>
fix: error in the fft error contribution, change the plots
</commit_message>
<xml_diff>
--- a/History_report.docx
+++ b/History_report.docx
@@ -39,6 +39,395 @@
       <w:r>
         <w:t xml:space="preserve">rsdft_dc = SDFT with resonator branch but in the error estimation is considered only the DC component</w:t>
       </w:r>
+    </w:p>
+    <w:p>
+      <w:pPr>
+        <w:spacing w:after="0"/>
+      </w:pPr>
+    </w:p>
+    <w:p>
+      <w:pPr>
+        <w:spacing w:after="0"/>
+        <w:rPr>
+          <w:b/>
+          <w:bCs/>
+        </w:rPr>
+      </w:pPr>
+      <w:r>
+        <w:rPr>
+          <w:b/>
+          <w:bCs/>
+        </w:rPr>
+        <w:t xml:space="preserve">24/10/2026</w:t>
+      </w:r>
+    </w:p>
+    <w:p>
+      <w:pPr>
+        <w:spacing w:after="0"/>
+        <w:rPr>
+          <w:b/>
+          <w:bCs/>
+        </w:rPr>
+      </w:pPr>
+      <w:r>
+        <w:rPr>
+          <w:b/>
+          <w:bCs/>
+        </w:rPr>
+        <w:t xml:space="preserve">23:17 </w:t>
+      </w:r>
+      <w:r>
+        <w:rPr>
+          <w:b w:val="0"/>
+          <w:bCs w:val="0"/>
+        </w:rPr>
+        <w:t xml:space="preserve">r = 0.99 for rsdft and rsdft_dc and r = 0.999 for msdft and msdft_dc. In the picture below are shown resonance frequencies due (i think) to the quantizer at 8 bit only. </w:t>
+      </w:r>
+    </w:p>
+    <w:p>
+      <w:pPr>
+        <w:spacing w:after="0"/>
+        <w:rPr>
+          <w:b w:val="0"/>
+          <w:bCs w:val="0"/>
+        </w:rPr>
+      </w:pPr>
+      <w:r>
+        <w:rPr>
+          <w:b w:val="0"/>
+          <w:bCs w:val="0"/>
+        </w:rPr>
+        <w:drawing>
+          <wp:inline distT="0" distB="0" distL="0" distR="0">
+            <wp:extent cx="5731510" cy="3416369"/>
+            <wp:effectExtent l="0" t="0" r="0" b="0"/>
+            <wp:docPr id="1" name="Picture 1" descr=""/>
+            <wp:cNvGraphicFramePr/>
+            <a:graphic>
+              <a:graphicData uri="http://schemas.openxmlformats.org/drawingml/2006/picture">
+                <pic:pic>
+                  <pic:nvPicPr>
+                    <pic:cNvPr id="0" name="image12.png" descr=""/>
+                    <pic:cNvPicPr>
+                      <a:picLocks noChangeAspect="1" noChangeArrowheads="1"/>
+                    </pic:cNvPicPr>
+                  </pic:nvPicPr>
+                  <pic:blipFill>
+                    <a:blip r:embed="rId1"/>
+                    <a:stretch>
+                      <a:fillRect/>
+                    </a:stretch>
+                  </pic:blipFill>
+                  <pic:spPr bwMode="auto">
+                    <a:xfrm>
+                      <a:off x="0" y="0"/>
+                      <a:ext cx="5731510" cy="3416369"/>
+                    </a:xfrm>
+                    <a:prstGeom prst="rect">
+                      <a:avLst/>
+                    </a:prstGeom>
+                  </pic:spPr>
+                </pic:pic>
+              </a:graphicData>
+            </a:graphic>
+          </wp:inline>
+        </w:drawing>
+      </w:r>
+    </w:p>
+    <w:p>
+      <w:pPr>
+        <w:spacing w:after="0"/>
+        <w:rPr>
+          <w:b/>
+          <w:bCs/>
+        </w:rPr>
+      </w:pPr>
+      <w:r>
+        <w:rPr>
+          <w:b/>
+          <w:bCs/>
+        </w:rPr>
+        <w:t xml:space="preserve">21:36 </w:t>
+      </w:r>
+      <w:r>
+        <w:rPr>
+          <w:b w:val="0"/>
+          <w:bCs w:val="0"/>
+        </w:rPr>
+        <w:t xml:space="preserve">possible solution choose r = 0.999 for msdft and msdft_dc</w:t>
+      </w:r>
+    </w:p>
+    <w:p>
+      <w:pPr>
+        <w:spacing w:after="0"/>
+        <w:rPr>
+          <w:b w:val="0"/>
+          <w:bCs w:val="0"/>
+        </w:rPr>
+      </w:pPr>
+      <w:r>
+        <w:rPr>
+          <w:b w:val="0"/>
+          <w:bCs w:val="0"/>
+        </w:rPr>
+        <w:drawing>
+          <wp:inline distT="0" distB="0" distL="0" distR="0">
+            <wp:extent cx="5731510" cy="3422486"/>
+            <wp:effectExtent l="0" t="0" r="0" b="0"/>
+            <wp:docPr id="2" name="Picture 2" descr=""/>
+            <wp:cNvGraphicFramePr/>
+            <a:graphic>
+              <a:graphicData uri="http://schemas.openxmlformats.org/drawingml/2006/picture">
+                <pic:pic>
+                  <pic:nvPicPr>
+                    <pic:cNvPr id="0" name="image11.png" descr=""/>
+                    <pic:cNvPicPr>
+                      <a:picLocks noChangeAspect="1" noChangeArrowheads="1"/>
+                    </pic:cNvPicPr>
+                  </pic:nvPicPr>
+                  <pic:blipFill>
+                    <a:blip r:embed="rId2"/>
+                    <a:stretch>
+                      <a:fillRect/>
+                    </a:stretch>
+                  </pic:blipFill>
+                  <pic:spPr bwMode="auto">
+                    <a:xfrm>
+                      <a:off x="0" y="0"/>
+                      <a:ext cx="5731510" cy="3422486"/>
+                    </a:xfrm>
+                    <a:prstGeom prst="rect">
+                      <a:avLst/>
+                    </a:prstGeom>
+                  </pic:spPr>
+                </pic:pic>
+              </a:graphicData>
+            </a:graphic>
+          </wp:inline>
+        </w:drawing>
+      </w:r>
+    </w:p>
+    <w:p>
+      <w:pPr>
+        <w:spacing w:after="0"/>
+        <w:rPr>
+          <w:b w:val="0"/>
+          <w:bCs w:val="0"/>
+        </w:rPr>
+      </w:pPr>
+      <w:r>
+        <w:rPr>
+          <w:b w:val="0"/>
+          <w:bCs w:val="0"/>
+        </w:rPr>
+        <w:t xml:space="preserve">It seems there is a resonance around 5kHz and 15kHz in both algorithms</w:t>
+      </w:r>
+    </w:p>
+    <w:p>
+      <w:pPr>
+        <w:spacing w:after="0"/>
+        <w:rPr>
+          <w:b/>
+          <w:bCs/>
+        </w:rPr>
+      </w:pPr>
+      <w:r>
+        <w:rPr>
+          <w:b/>
+          <w:bCs/>
+        </w:rPr>
+        <w:t xml:space="preserve">21:23 </w:t>
+      </w:r>
+      <w:r>
+        <w:rPr>
+          <w:b w:val="0"/>
+          <w:bCs w:val="0"/>
+        </w:rPr>
+        <w:t xml:space="preserve">New problem with msdft_dc:</w:t>
+      </w:r>
+    </w:p>
+    <w:p>
+      <w:pPr>
+        <w:spacing w:after="0"/>
+        <w:rPr>
+          <w:b w:val="0"/>
+          <w:bCs w:val="0"/>
+        </w:rPr>
+      </w:pPr>
+      <w:r>
+        <w:rPr>
+          <w:b w:val="0"/>
+          <w:bCs w:val="0"/>
+        </w:rPr>
+        <w:drawing>
+          <wp:inline distT="0" distB="0" distL="0" distR="0">
+            <wp:extent cx="5731510" cy="3399096"/>
+            <wp:effectExtent l="0" t="0" r="0" b="0"/>
+            <wp:docPr id="3" name="Picture 3" descr=""/>
+            <wp:cNvGraphicFramePr/>
+            <a:graphic>
+              <a:graphicData uri="http://schemas.openxmlformats.org/drawingml/2006/picture">
+                <pic:pic>
+                  <pic:nvPicPr>
+                    <pic:cNvPr id="0" name="image10.png" descr=""/>
+                    <pic:cNvPicPr>
+                      <a:picLocks noChangeAspect="1" noChangeArrowheads="1"/>
+                    </pic:cNvPicPr>
+                  </pic:nvPicPr>
+                  <pic:blipFill>
+                    <a:blip r:embed="rId3"/>
+                    <a:stretch>
+                      <a:fillRect/>
+                    </a:stretch>
+                  </pic:blipFill>
+                  <pic:spPr bwMode="auto">
+                    <a:xfrm>
+                      <a:off x="0" y="0"/>
+                      <a:ext cx="5731510" cy="3399096"/>
+                    </a:xfrm>
+                    <a:prstGeom prst="rect">
+                      <a:avLst/>
+                    </a:prstGeom>
+                  </pic:spPr>
+                </pic:pic>
+              </a:graphicData>
+            </a:graphic>
+          </wp:inline>
+        </w:drawing>
+      </w:r>
+    </w:p>
+    <w:p>
+      <w:pPr>
+        <w:spacing w:after="0"/>
+        <w:rPr>
+          <w:b w:val="0"/>
+          <w:bCs w:val="0"/>
+        </w:rPr>
+      </w:pPr>
+      <w:r>
+        <w:rPr>
+          <w:b w:val="0"/>
+          <w:bCs w:val="0"/>
+        </w:rPr>
+        <w:t xml:space="preserve">It seems a resonation point, maybe is given by r = 1 for both msdft and msdft_dc</w:t>
+      </w:r>
+    </w:p>
+    <w:p>
+      <w:pPr>
+        <w:spacing w:after="0"/>
+        <w:rPr>
+          <w:b w:val="0"/>
+          <w:bCs w:val="0"/>
+        </w:rPr>
+      </w:pPr>
+    </w:p>
+    <w:p>
+      <w:pPr>
+        <w:spacing w:after="0"/>
+        <w:rPr>
+          <w:b/>
+          <w:bCs/>
+        </w:rPr>
+      </w:pPr>
+    </w:p>
+    <w:p>
+      <w:pPr>
+        <w:spacing w:after="0"/>
+        <w:rPr>
+          <w:b/>
+          <w:bCs/>
+        </w:rPr>
+      </w:pPr>
+      <w:r>
+        <w:rPr>
+          <w:b/>
+          <w:bCs/>
+        </w:rPr>
+        <w:t xml:space="preserve">19:30 </w:t>
+      </w:r>
+      <w:r>
+        <w:rPr>
+          <w:b w:val="0"/>
+          <w:bCs w:val="0"/>
+        </w:rPr>
+        <w:t xml:space="preserve">finished to modify summary plots and fixed some errors in the code (abs(spectr_fft) before the complex error calculation).</w:t>
+      </w:r>
+    </w:p>
+    <w:p>
+      <w:pPr>
+        <w:spacing w:after="0"/>
+        <w:rPr>
+          <w:b w:val="0"/>
+          <w:bCs w:val="0"/>
+        </w:rPr>
+      </w:pPr>
+      <w:r>
+        <w:rPr>
+          <w:b w:val="0"/>
+          <w:bCs w:val="0"/>
+        </w:rPr>
+        <w:t xml:space="preserve">2 types of results:</w:t>
+      </w:r>
+    </w:p>
+    <w:p>
+      <w:pPr>
+        <w:pStyle w:val="ListParagraph"/>
+        <w:numPr>
+          <w:ilvl w:val="0"/>
+          <w:numId w:val="1"/>
+        </w:numPr>
+        <w:spacing w:after="0"/>
+        <w:rPr>
+          <w:b w:val="0"/>
+          <w:bCs w:val="0"/>
+        </w:rPr>
+      </w:pPr>
+      <w:r>
+        <w:rPr>
+          <w:b w:val="0"/>
+          <w:bCs w:val="0"/>
+        </w:rPr>
+        <w:t xml:space="preserve">images_rsdft_r1: here results are calculated considering r = 1 w.r.t. Rsdft and rsdft_dc</w:t>
+      </w:r>
+    </w:p>
+    <w:p>
+      <w:pPr>
+        <w:pStyle w:val="ListParagraph"/>
+        <w:numPr>
+          <w:ilvl w:val="0"/>
+          <w:numId w:val="1"/>
+        </w:numPr>
+        <w:spacing w:after="0"/>
+        <w:rPr>
+          <w:b w:val="0"/>
+          <w:bCs w:val="0"/>
+        </w:rPr>
+      </w:pPr>
+      <w:r>
+        <w:rPr>
+          <w:b w:val="0"/>
+          <w:bCs w:val="0"/>
+        </w:rPr>
+        <w:t xml:space="preserve">images_rsdft_r995: r = 0.995 for both rsdft and rsdft_dc</w:t>
+      </w:r>
+    </w:p>
+    <w:p>
+      <w:pPr>
+        <w:spacing w:after="0"/>
+        <w:rPr>
+          <w:b w:val="0"/>
+          <w:bCs w:val="0"/>
+        </w:rPr>
+      </w:pPr>
+    </w:p>
+    <w:p>
+      <w:pPr>
+        <w:spacing w:after="0"/>
+        <w:rPr>
+          <w:b w:val="0"/>
+          <w:bCs w:val="0"/>
+        </w:rPr>
+      </w:pPr>
     </w:p>
     <w:p>
       <w:pPr>
@@ -104,7 +493,7 @@
             <wp:extent cx="12700" cy="12700"/>
             <wp:effectExtent l="0" t="0" r="0" b="0"/>
             <wp:wrapNone/>
-            <wp:docPr id="1" name="Ink Pencil 1 #6" descr=""/>
+            <wp:docPr id="4" name="Ink Pencil 4 #6" descr=""/>
             <wp:cNvGraphicFramePr/>
             <a:graphic>
               <a:graphicData uri="http://schemas.microsoft.com/office/word/2010/wordprocessingShape">
@@ -180,7 +569,7 @@
           <wp:inline distT="0" distB="0" distL="0" distR="0">
             <wp:extent cx="5731256" cy="1959110"/>
             <wp:effectExtent l="0" t="0" r="0" b="0"/>
-            <wp:docPr id="2" name="Picture 2" descr=""/>
+            <wp:docPr id="5" name="Picture 5" descr=""/>
             <wp:cNvGraphicFramePr/>
             <a:graphic>
               <a:graphicData uri="http://schemas.openxmlformats.org/drawingml/2006/picture">
@@ -192,7 +581,7 @@
                     </pic:cNvPicPr>
                   </pic:nvPicPr>
                   <pic:blipFill>
-                    <a:blip r:embed="rId1"/>
+                    <a:blip r:embed="rId4"/>
                     <a:stretch>
                       <a:fillRect/>
                     </a:stretch>
@@ -231,7 +620,7 @@
           <wp:inline distT="0" distB="0" distL="0" distR="0">
             <wp:extent cx="5731256" cy="4743663"/>
             <wp:effectExtent l="0" t="0" r="0" b="0"/>
-            <wp:docPr id="3" name="Picture 3" descr=""/>
+            <wp:docPr id="6" name="Picture 6" descr=""/>
             <wp:cNvGraphicFramePr/>
             <a:graphic>
               <a:graphicData uri="http://schemas.openxmlformats.org/drawingml/2006/picture">
@@ -243,7 +632,7 @@
                     </pic:cNvPicPr>
                   </pic:nvPicPr>
                   <pic:blipFill>
-                    <a:blip r:embed="rId2"/>
+                    <a:blip r:embed="rId5"/>
                     <a:stretch>
                       <a:fillRect/>
                     </a:stretch>
@@ -287,7 +676,7 @@
           <wp:inline distT="0" distB="0" distL="0" distR="0">
             <wp:extent cx="5731256" cy="1979574"/>
             <wp:effectExtent l="0" t="0" r="0" b="0"/>
-            <wp:docPr id="4" name="Picture 4" descr=""/>
+            <wp:docPr id="7" name="Picture 7" descr=""/>
             <wp:cNvGraphicFramePr/>
             <a:graphic>
               <a:graphicData uri="http://schemas.openxmlformats.org/drawingml/2006/picture">
@@ -299,7 +688,7 @@
                     </pic:cNvPicPr>
                   </pic:nvPicPr>
                   <pic:blipFill>
-                    <a:blip r:embed="rId3"/>
+                    <a:blip r:embed="rId6"/>
                     <a:stretch>
                       <a:fillRect/>
                     </a:stretch>
@@ -324,7 +713,7 @@
           <wp:inline distT="0" distB="0" distL="0" distR="0">
             <wp:extent cx="5288424" cy="4377138"/>
             <wp:effectExtent l="0" t="0" r="0" b="0"/>
-            <wp:docPr id="5" name="Picture 5" descr=""/>
+            <wp:docPr id="8" name="Picture 8" descr=""/>
             <wp:cNvGraphicFramePr/>
             <a:graphic>
               <a:graphicData uri="http://schemas.openxmlformats.org/drawingml/2006/picture">
@@ -336,7 +725,7 @@
                     </pic:cNvPicPr>
                   </pic:nvPicPr>
                   <pic:blipFill>
-                    <a:blip r:embed="rId4"/>
+                    <a:blip r:embed="rId7"/>
                     <a:stretch>
                       <a:fillRect/>
                     </a:stretch>
@@ -431,7 +820,7 @@
             <wp:extent cx="12700" cy="12700"/>
             <wp:effectExtent l="0" t="0" r="0" b="0"/>
             <wp:wrapNone/>
-            <wp:docPr id="6" name="Ink Pen 6 #5" descr=""/>
+            <wp:docPr id="9" name="Ink Pen 9 #5" descr=""/>
             <wp:cNvGraphicFramePr/>
             <a:graphic>
               <a:graphicData uri="http://schemas.microsoft.com/office/word/2010/wordprocessingShape">
@@ -479,7 +868,7 @@
           <wp:inline distT="0" distB="0" distL="0" distR="0">
             <wp:extent cx="5731256" cy="1982239"/>
             <wp:effectExtent l="0" t="0" r="0" b="0"/>
-            <wp:docPr id="7" name="Picture 7" descr=""/>
+            <wp:docPr id="10" name="Picture 10" descr=""/>
             <wp:cNvGraphicFramePr/>
             <a:graphic>
               <a:graphicData uri="http://schemas.openxmlformats.org/drawingml/2006/picture">
@@ -491,7 +880,7 @@
                     </pic:cNvPicPr>
                   </pic:nvPicPr>
                   <pic:blipFill>
-                    <a:blip r:embed="rId5"/>
+                    <a:blip r:embed="rId8"/>
                     <a:stretch>
                       <a:fillRect/>
                     </a:stretch>
@@ -539,7 +928,7 @@
             <wp:extent cx="12700" cy="12700"/>
             <wp:effectExtent l="0" t="0" r="0" b="0"/>
             <wp:wrapNone/>
-            <wp:docPr id="8" name="Ink Pen 8 #3" descr=""/>
+            <wp:docPr id="11" name="Ink Pen 11 #3" descr=""/>
             <wp:cNvGraphicFramePr/>
             <a:graphic>
               <a:graphicData uri="http://schemas.microsoft.com/office/word/2010/wordprocessingShape">
@@ -598,7 +987,7 @@
             <wp:extent cx="12700" cy="12700"/>
             <wp:effectExtent l="0" t="0" r="0" b="0"/>
             <wp:wrapNone/>
-            <wp:docPr id="9" name="Ink Pen 9 #2" descr=""/>
+            <wp:docPr id="12" name="Ink Pen 12 #2" descr=""/>
             <wp:cNvGraphicFramePr/>
             <a:graphic>
               <a:graphicData uri="http://schemas.microsoft.com/office/word/2010/wordprocessingShape">
@@ -657,7 +1046,7 @@
             <wp:extent cx="754562" cy="1159843"/>
             <wp:effectExtent l="0" t="0" r="0" b="0"/>
             <wp:wrapNone/>
-            <wp:docPr id="10" name="Ink Pen 10 #1" descr=""/>
+            <wp:docPr id="13" name="Ink Pen 13 #1" descr=""/>
             <wp:cNvGraphicFramePr/>
             <a:graphic>
               <a:graphicData uri="http://schemas.microsoft.com/office/word/2010/wordprocessingShape">
@@ -1074,7 +1463,7 @@
           <wp:inline distT="0" distB="0" distL="0" distR="0">
             <wp:extent cx="5731256" cy="4743663"/>
             <wp:effectExtent l="0" t="0" r="0" b="0"/>
-            <wp:docPr id="11" name="Picture 11" descr=""/>
+            <wp:docPr id="14" name="Picture 14" descr=""/>
             <wp:cNvGraphicFramePr/>
             <a:graphic>
               <a:graphicData uri="http://schemas.openxmlformats.org/drawingml/2006/picture">
@@ -1086,7 +1475,7 @@
                     </pic:cNvPicPr>
                   </pic:nvPicPr>
                   <pic:blipFill>
-                    <a:blip r:embed="rId6"/>
+                    <a:blip r:embed="rId9"/>
                     <a:stretch>
                       <a:fillRect/>
                     </a:stretch>
@@ -1147,7 +1536,7 @@
           <wp:inline distT="0" distB="0" distL="0" distR="0">
             <wp:extent cx="4714875" cy="3667125"/>
             <wp:effectExtent l="0" t="0" r="0" b="0"/>
-            <wp:docPr id="12" name="Picture 12" descr=""/>
+            <wp:docPr id="15" name="Picture 15" descr=""/>
             <wp:cNvGraphicFramePr/>
             <a:graphic>
               <a:graphicData uri="http://schemas.openxmlformats.org/drawingml/2006/picture">
@@ -1159,7 +1548,7 @@
                     </pic:cNvPicPr>
                   </pic:nvPicPr>
                   <pic:blipFill>
-                    <a:blip r:embed="rId7"/>
+                    <a:blip r:embed="rId10"/>
                     <a:stretch>
                       <a:fillRect/>
                     </a:stretch>
@@ -1188,6 +1577,122 @@
     </w:sectPr>
   </w:body>
 </w:document>
+</file>
+
+<file path=word/numbering.xml><?xml version="1.0" encoding="utf-8"?>
+<w:numbering xmlns:w="http://schemas.openxmlformats.org/wordprocessingml/2006/main" xmlns:r="http://schemas.openxmlformats.org/officeDocument/2006/relationships" xmlns:wp="http://schemas.openxmlformats.org/drawingml/2006/wordprocessingDrawing" xmlns:a="http://schemas.openxmlformats.org/drawingml/2006/main" xmlns:c="http://schemas.openxmlformats.org/drawingml/2006/chart" xmlns:pic="http://schemas.openxmlformats.org/drawingml/2006/picture" xmlns:mc="http://schemas.openxmlformats.org/markup-compatibility/2006" xmlns:w14="http://schemas.microsoft.com/office/word/2010/wordml" xmlns:wpi="http://schemas.microsoft.com/office/word/2010/wordprocessingInk" xmlns:w15="http://schemas.microsoft.com/office/word/2012/wordml" xmlns:wp14="http://schemas.microsoft.com/office/word/2010/wordprocessingDrawing" xmlns:wps="http://schemas.microsoft.com/office/word/2010/wordprocessingShape" xmlns:wpg="http://schemas.microsoft.com/office/word/2010/wordprocessingGroup" xmlns:wpc="http://schemas.microsoft.com/office/word/2010/wordprocessingCanvas" xmlns:dgm="http://schemas.openxmlformats.org/drawingml/2006/diagram" xmlns:dsp="http://schemas.microsoft.com/office/drawing/2008/diagram" xmlns:m="http://schemas.openxmlformats.org/officeDocument/2006/math" xmlns:v="urn:schemas-microsoft-com:vml" xmlns:o="urn:schemas-microsoft-com:office:office" xmlns:w10="urn:schemas-microsoft-com:office:word" xmlns:cx="http://schemas.microsoft.com/office/drawing/2014/chartex" xmlns:cx1="http://schemas.microsoft.com/office/drawing/2015/9/8/chartex" xmlns:cx2="http://schemas.microsoft.com/office/drawing/2015/10/21/chartex" xmlns:cx3="http://schemas.microsoft.com/office/drawing/2016/5/9/chartex" xmlns:cx4="http://schemas.microsoft.com/office/drawing/2016/5/10/chartex" xmlns:cx5="http://schemas.microsoft.com/office/drawing/2016/5/11/chartex" xmlns:cx6="http://schemas.microsoft.com/office/drawing/2016/5/12/chartex" xmlns:cx7="http://schemas.microsoft.com/office/drawing/2016/5/13/chartex" xmlns:cx8="http://schemas.microsoft.com/office/drawing/2016/5/14/chartex" mc:Ignorable="w14 w15 wp14">
+  <w:abstractNum w:abstractNumId="0">
+    <w:multiLevelType w:val="multilevel"/>
+    <w:lvl w:ilvl="0">
+      <w:start w:val="1"/>
+      <w:numFmt w:val="bullet"/>
+      <w:lvlText w:val="-"/>
+      <w:lvlJc w:val="left"/>
+      <w:pPr>
+        <w:ind w:left="720" w:hanging="360"/>
+      </w:pPr>
+    </w:lvl>
+    <w:lvl w:ilvl="1">
+      <w:start w:val="1"/>
+      <w:numFmt w:val="bullet"/>
+      <w:lvlText w:val="○"/>
+      <w:lvlJc w:val="left"/>
+      <w:pPr>
+        <w:ind w:left="1440" w:hanging="360"/>
+      </w:pPr>
+      <w:rPr>
+        <w:rFonts w:ascii="Arial" w:hAnsi="Arial"/>
+      </w:rPr>
+    </w:lvl>
+    <w:lvl w:ilvl="2">
+      <w:start w:val="1"/>
+      <w:numFmt w:val="bullet"/>
+      <w:lvlText w:val="▪"/>
+      <w:lvlJc w:val="left"/>
+      <w:pPr>
+        <w:ind w:left="2160" w:hanging="360"/>
+      </w:pPr>
+      <w:rPr>
+        <w:rFonts w:ascii="Arial" w:hAnsi="Arial"/>
+      </w:rPr>
+    </w:lvl>
+    <w:lvl w:ilvl="3">
+      <w:start w:val="1"/>
+      <w:numFmt w:val="bullet"/>
+      <w:lvlText w:val="•"/>
+      <w:lvlJc w:val="left"/>
+      <w:pPr>
+        <w:ind w:left="2880" w:hanging="360"/>
+      </w:pPr>
+      <w:rPr>
+        <w:rFonts w:ascii="Arial" w:hAnsi="Arial"/>
+      </w:rPr>
+    </w:lvl>
+    <w:lvl w:ilvl="4">
+      <w:start w:val="1"/>
+      <w:numFmt w:val="bullet"/>
+      <w:lvlText w:val="○"/>
+      <w:lvlJc w:val="left"/>
+      <w:pPr>
+        <w:ind w:left="3600" w:hanging="360"/>
+      </w:pPr>
+      <w:rPr>
+        <w:rFonts w:ascii="Arial" w:hAnsi="Arial"/>
+      </w:rPr>
+    </w:lvl>
+    <w:lvl w:ilvl="5">
+      <w:start w:val="1"/>
+      <w:numFmt w:val="bullet"/>
+      <w:lvlText w:val="▪"/>
+      <w:lvlJc w:val="left"/>
+      <w:pPr>
+        <w:ind w:left="4320" w:hanging="360"/>
+      </w:pPr>
+      <w:rPr>
+        <w:rFonts w:ascii="Arial" w:hAnsi="Arial"/>
+      </w:rPr>
+    </w:lvl>
+    <w:lvl w:ilvl="6">
+      <w:start w:val="1"/>
+      <w:numFmt w:val="bullet"/>
+      <w:lvlText w:val="•"/>
+      <w:lvlJc w:val="left"/>
+      <w:pPr>
+        <w:ind w:left="5040" w:hanging="360"/>
+      </w:pPr>
+      <w:rPr>
+        <w:rFonts w:ascii="Arial" w:hAnsi="Arial"/>
+      </w:rPr>
+    </w:lvl>
+    <w:lvl w:ilvl="7">
+      <w:start w:val="1"/>
+      <w:numFmt w:val="bullet"/>
+      <w:lvlText w:val="○"/>
+      <w:lvlJc w:val="left"/>
+      <w:pPr>
+        <w:ind w:left="5760" w:hanging="360"/>
+      </w:pPr>
+      <w:rPr>
+        <w:rFonts w:ascii="Arial" w:hAnsi="Arial"/>
+      </w:rPr>
+    </w:lvl>
+    <w:lvl w:ilvl="8">
+      <w:start w:val="1"/>
+      <w:numFmt w:val="bullet"/>
+      <w:lvlText w:val="▪"/>
+      <w:lvlJc w:val="left"/>
+      <w:pPr>
+        <w:ind w:left="6480" w:hanging="360"/>
+      </w:pPr>
+      <w:rPr>
+        <w:rFonts w:ascii="Arial" w:hAnsi="Arial"/>
+      </w:rPr>
+    </w:lvl>
+  </w:abstractNum>
+  <w:num w:numId="1">
+    <w:abstractNumId w:val="0"/>
+  </w:num>
+</w:numbering>
 </file>
 
 <file path=word/styles.xml><?xml version="1.0" encoding="utf-8"?>

</xml_diff>

<commit_message>
update: hystory report with abs(twiddles) thoughts
</commit_message>
<xml_diff>
--- a/History_report.docx
+++ b/History_report.docx
@@ -58,6 +58,623 @@
           <w:b/>
           <w:bCs/>
         </w:rPr>
+        <w:t xml:space="preserve">27/10/2026</w:t>
+      </w:r>
+    </w:p>
+    <w:p>
+      <w:pPr>
+        <w:spacing w:after="0"/>
+        <w:rPr>
+          <w:b/>
+          <w:bCs/>
+        </w:rPr>
+      </w:pPr>
+      <w:r>
+        <w:rPr>
+          <w:b/>
+          <w:bCs/>
+        </w:rPr>
+        <w:t xml:space="preserve">21:51 </w:t>
+      </w:r>
+      <w:r>
+        <w:rPr>
+          <w:b w:val="0"/>
+          <w:bCs w:val="0"/>
+        </w:rPr>
+        <w:t xml:space="preserve">Debug run to check twiddle factors: for rsdft and rsdft_dc the abs(twiddle) &gt; 1, to be sure the twiddle factor remains inside the unitary circle is choosen r=0.999 (the twiddle calculation is the same for both).</w:t>
+      </w:r>
+    </w:p>
+    <w:p>
+      <w:pPr>
+        <w:spacing w:after="0"/>
+        <w:rPr>
+          <w:b w:val="0"/>
+          <w:bCs w:val="0"/>
+        </w:rPr>
+      </w:pPr>
+      <w:r>
+        <w:rPr>
+          <w:b w:val="0"/>
+          <w:bCs w:val="0"/>
+        </w:rPr>
+        <w:drawing>
+          <wp:inline distT="0" distB="0" distL="0" distR="0">
+            <wp:extent cx="5731510" cy="1103846"/>
+            <wp:effectExtent l="0" t="0" r="0" b="0"/>
+            <wp:docPr id="1" name="Picture 1" descr=""/>
+            <wp:cNvGraphicFramePr/>
+            <a:graphic>
+              <a:graphicData uri="http://schemas.openxmlformats.org/drawingml/2006/picture">
+                <pic:pic>
+                  <pic:nvPicPr>
+                    <pic:cNvPr id="0" name="image18.png" descr=""/>
+                    <pic:cNvPicPr>
+                      <a:picLocks noChangeAspect="1" noChangeArrowheads="1"/>
+                    </pic:cNvPicPr>
+                  </pic:nvPicPr>
+                  <pic:blipFill>
+                    <a:blip r:embed="rId1"/>
+                    <a:stretch>
+                      <a:fillRect/>
+                    </a:stretch>
+                  </pic:blipFill>
+                  <pic:spPr bwMode="auto">
+                    <a:xfrm>
+                      <a:off x="0" y="0"/>
+                      <a:ext cx="5731510" cy="1103846"/>
+                    </a:xfrm>
+                    <a:prstGeom prst="rect">
+                      <a:avLst/>
+                    </a:prstGeom>
+                  </pic:spPr>
+                </pic:pic>
+              </a:graphicData>
+            </a:graphic>
+          </wp:inline>
+        </w:drawing>
+      </w:r>
+    </w:p>
+    <w:p>
+      <w:pPr>
+        <w:spacing w:after="0"/>
+        <w:rPr>
+          <w:b w:val="0"/>
+          <w:bCs w:val="0"/>
+        </w:rPr>
+      </w:pPr>
+      <w:r>
+        <w:rPr>
+          <w:b w:val="0"/>
+          <w:bCs w:val="0"/>
+        </w:rPr>
+        <w:drawing>
+          <wp:inline distT="0" distB="0" distL="0" distR="0">
+            <wp:extent cx="4638675" cy="1428750"/>
+            <wp:effectExtent l="0" t="0" r="0" b="0"/>
+            <wp:docPr id="2" name="Picture 2" descr=""/>
+            <wp:cNvGraphicFramePr/>
+            <a:graphic>
+              <a:graphicData uri="http://schemas.openxmlformats.org/drawingml/2006/picture">
+                <pic:pic>
+                  <pic:nvPicPr>
+                    <pic:cNvPr id="0" name="image13.png" descr=""/>
+                    <pic:cNvPicPr>
+                      <a:picLocks noChangeAspect="1" noChangeArrowheads="1"/>
+                    </pic:cNvPicPr>
+                  </pic:nvPicPr>
+                  <pic:blipFill>
+                    <a:blip r:embed="rId2"/>
+                    <a:stretch>
+                      <a:fillRect/>
+                    </a:stretch>
+                  </pic:blipFill>
+                  <pic:spPr bwMode="auto">
+                    <a:xfrm>
+                      <a:off x="0" y="0"/>
+                      <a:ext cx="4638675" cy="1428750"/>
+                    </a:xfrm>
+                    <a:prstGeom prst="rect">
+                      <a:avLst/>
+                    </a:prstGeom>
+                  </pic:spPr>
+                </pic:pic>
+              </a:graphicData>
+            </a:graphic>
+          </wp:inline>
+        </w:drawing>
+      </w:r>
+    </w:p>
+    <w:p>
+      <w:pPr>
+        <w:spacing w:after="0"/>
+        <w:rPr>
+          <w:b w:val="0"/>
+          <w:bCs w:val="0"/>
+        </w:rPr>
+      </w:pPr>
+      <w:r>
+        <w:rPr>
+          <w:b w:val="0"/>
+          <w:bCs w:val="0"/>
+        </w:rPr>
+        <w:drawing>
+          <wp:inline distT="0" distB="0" distL="0" distR="0">
+            <wp:extent cx="5438775" cy="1381125"/>
+            <wp:effectExtent l="0" t="0" r="0" b="0"/>
+            <wp:docPr id="3" name="Picture 3" descr=""/>
+            <wp:cNvGraphicFramePr/>
+            <a:graphic>
+              <a:graphicData uri="http://schemas.openxmlformats.org/drawingml/2006/picture">
+                <pic:pic>
+                  <pic:nvPicPr>
+                    <pic:cNvPr id="0" name="image14.png" descr=""/>
+                    <pic:cNvPicPr>
+                      <a:picLocks noChangeAspect="1" noChangeArrowheads="1"/>
+                    </pic:cNvPicPr>
+                  </pic:nvPicPr>
+                  <pic:blipFill>
+                    <a:blip r:embed="rId3"/>
+                    <a:stretch>
+                      <a:fillRect/>
+                    </a:stretch>
+                  </pic:blipFill>
+                  <pic:spPr bwMode="auto">
+                    <a:xfrm>
+                      <a:off x="0" y="0"/>
+                      <a:ext cx="5438775" cy="1381125"/>
+                    </a:xfrm>
+                    <a:prstGeom prst="rect">
+                      <a:avLst/>
+                    </a:prstGeom>
+                  </pic:spPr>
+                </pic:pic>
+              </a:graphicData>
+            </a:graphic>
+          </wp:inline>
+        </w:drawing>
+      </w:r>
+    </w:p>
+    <w:p>
+      <w:pPr>
+        <w:spacing w:after="0"/>
+        <w:rPr>
+          <w:b w:val="0"/>
+          <w:bCs w:val="0"/>
+        </w:rPr>
+      </w:pPr>
+      <w:r>
+        <w:rPr>
+          <w:b w:val="0"/>
+          <w:bCs w:val="0"/>
+        </w:rPr>
+        <w:drawing>
+          <wp:inline distT="0" distB="0" distL="0" distR="0">
+            <wp:extent cx="5731510" cy="1083024"/>
+            <wp:effectExtent l="0" t="0" r="0" b="0"/>
+            <wp:docPr id="4" name="Picture 4" descr=""/>
+            <wp:cNvGraphicFramePr/>
+            <a:graphic>
+              <a:graphicData uri="http://schemas.openxmlformats.org/drawingml/2006/picture">
+                <pic:pic>
+                  <pic:nvPicPr>
+                    <pic:cNvPr id="0" name="image17.png" descr=""/>
+                    <pic:cNvPicPr>
+                      <a:picLocks noChangeAspect="1" noChangeArrowheads="1"/>
+                    </pic:cNvPicPr>
+                  </pic:nvPicPr>
+                  <pic:blipFill>
+                    <a:blip r:embed="rId4"/>
+                    <a:stretch>
+                      <a:fillRect/>
+                    </a:stretch>
+                  </pic:blipFill>
+                  <pic:spPr bwMode="auto">
+                    <a:xfrm>
+                      <a:off x="0" y="0"/>
+                      <a:ext cx="5731510" cy="1083024"/>
+                    </a:xfrm>
+                    <a:prstGeom prst="rect">
+                      <a:avLst/>
+                    </a:prstGeom>
+                  </pic:spPr>
+                </pic:pic>
+              </a:graphicData>
+            </a:graphic>
+          </wp:inline>
+        </w:drawing>
+      </w:r>
+    </w:p>
+    <w:p>
+      <w:pPr>
+        <w:spacing w:after="0"/>
+        <w:rPr>
+          <w:b w:val="0"/>
+          <w:bCs w:val="0"/>
+        </w:rPr>
+      </w:pPr>
+    </w:p>
+    <w:p>
+      <w:pPr>
+        <w:spacing w:after="0"/>
+        <w:rPr>
+          <w:b w:val="0"/>
+          <w:bCs w:val="0"/>
+        </w:rPr>
+      </w:pPr>
+    </w:p>
+    <w:p>
+      <w:pPr>
+        <w:spacing w:after="0"/>
+        <w:rPr>
+          <w:b w:val="0"/>
+          <w:bCs w:val="0"/>
+        </w:rPr>
+      </w:pPr>
+    </w:p>
+    <w:p>
+      <w:pPr>
+        <w:spacing w:after="0"/>
+        <w:rPr>
+          <w:b w:val="0"/>
+          <w:bCs w:val="0"/>
+        </w:rPr>
+      </w:pPr>
+    </w:p>
+    <w:p>
+      <w:pPr>
+        <w:spacing w:after="0"/>
+        <w:rPr>
+          <w:b w:val="0"/>
+          <w:bCs w:val="0"/>
+        </w:rPr>
+      </w:pPr>
+    </w:p>
+    <w:p>
+      <w:pPr>
+        <w:spacing w:after="0"/>
+        <w:rPr>
+          <w:b w:val="0"/>
+          <w:bCs w:val="0"/>
+        </w:rPr>
+      </w:pPr>
+    </w:p>
+    <w:p>
+      <w:pPr>
+        <w:spacing w:after="0"/>
+        <w:rPr>
+          <w:b w:val="0"/>
+          <w:bCs w:val="0"/>
+        </w:rPr>
+      </w:pPr>
+    </w:p>
+    <w:p>
+      <w:pPr>
+        <w:spacing w:after="0"/>
+        <w:rPr>
+          <w:b w:val="0"/>
+          <w:bCs w:val="0"/>
+        </w:rPr>
+      </w:pPr>
+    </w:p>
+    <w:p>
+      <w:pPr>
+        <w:spacing w:after="0"/>
+        <w:rPr>
+          <w:b w:val="0"/>
+          <w:bCs w:val="0"/>
+        </w:rPr>
+      </w:pPr>
+    </w:p>
+    <w:p>
+      <w:pPr>
+        <w:spacing w:after="0"/>
+        <w:rPr>
+          <w:b w:val="0"/>
+          <w:bCs w:val="0"/>
+        </w:rPr>
+      </w:pPr>
+    </w:p>
+    <w:p>
+      <w:pPr>
+        <w:spacing w:after="0"/>
+        <w:rPr>
+          <w:b w:val="0"/>
+          <w:bCs w:val="0"/>
+        </w:rPr>
+      </w:pPr>
+    </w:p>
+    <w:p>
+      <w:pPr>
+        <w:spacing w:after="0"/>
+        <w:rPr>
+          <w:b w:val="0"/>
+          <w:bCs w:val="0"/>
+        </w:rPr>
+      </w:pPr>
+    </w:p>
+    <w:p>
+      <w:pPr>
+        <w:spacing w:after="0"/>
+        <w:rPr>
+          <w:b w:val="0"/>
+          <w:bCs w:val="0"/>
+        </w:rPr>
+      </w:pPr>
+    </w:p>
+    <w:p>
+      <w:pPr>
+        <w:spacing w:after="0"/>
+        <w:rPr>
+          <w:b w:val="0"/>
+          <w:bCs w:val="0"/>
+        </w:rPr>
+      </w:pPr>
+    </w:p>
+    <w:p>
+      <w:pPr>
+        <w:spacing w:after="0"/>
+        <w:rPr>
+          <w:b w:val="0"/>
+          <w:bCs w:val="0"/>
+        </w:rPr>
+      </w:pPr>
+    </w:p>
+    <w:p>
+      <w:pPr>
+        <w:spacing w:after="0"/>
+        <w:rPr>
+          <w:b w:val="0"/>
+          <w:bCs w:val="0"/>
+        </w:rPr>
+      </w:pPr>
+    </w:p>
+    <w:p>
+      <w:pPr>
+        <w:spacing w:after="0"/>
+        <w:rPr>
+          <w:b w:val="0"/>
+          <w:bCs w:val="0"/>
+        </w:rPr>
+      </w:pPr>
+    </w:p>
+    <w:p>
+      <w:pPr>
+        <w:spacing w:after="0"/>
+        <w:rPr>
+          <w:b w:val="0"/>
+          <w:bCs w:val="0"/>
+        </w:rPr>
+      </w:pPr>
+      <w:r>
+        <w:rPr>
+          <w:b w:val="0"/>
+          <w:bCs w:val="0"/>
+        </w:rPr>
+        <w:t xml:space="preserve">Msdft ideal and msdft_dc ideal respect the unitary circumference, but not the quantized versions. In the picture: 1 referes to quantized, 2 to ideal. The lists under test are made appending twiddles at every cycle</w:t>
+        <w:br/>
+      </w:r>
+      <w:r>
+        <w:rPr>
+          <w:b w:val="0"/>
+          <w:bCs w:val="0"/>
+        </w:rPr>
+        <w:drawing>
+          <wp:inline distT="0" distB="0" distL="0" distR="0">
+            <wp:extent cx="2487274" cy="5928370"/>
+            <wp:effectExtent l="0" t="0" r="0" b="0"/>
+            <wp:docPr id="5" name="Picture 5" descr=""/>
+            <wp:cNvGraphicFramePr/>
+            <a:graphic>
+              <a:graphicData uri="http://schemas.openxmlformats.org/drawingml/2006/picture">
+                <pic:pic>
+                  <pic:nvPicPr>
+                    <pic:cNvPr id="0" name="image15.png" descr=""/>
+                    <pic:cNvPicPr>
+                      <a:picLocks noChangeAspect="1" noChangeArrowheads="1"/>
+                    </pic:cNvPicPr>
+                  </pic:nvPicPr>
+                  <pic:blipFill>
+                    <a:blip r:embed="rId5"/>
+                    <a:stretch>
+                      <a:fillRect/>
+                    </a:stretch>
+                  </pic:blipFill>
+                  <pic:spPr bwMode="auto">
+                    <a:xfrm>
+                      <a:off x="0" y="0"/>
+                      <a:ext cx="2487274" cy="5928370"/>
+                    </a:xfrm>
+                    <a:prstGeom prst="rect">
+                      <a:avLst/>
+                    </a:prstGeom>
+                  </pic:spPr>
+                </pic:pic>
+              </a:graphicData>
+            </a:graphic>
+          </wp:inline>
+        </w:drawing>
+      </w:r>
+      <w:r>
+        <w:rPr>
+          <w:b w:val="0"/>
+          <w:bCs w:val="0"/>
+        </w:rPr>
+        <w:t xml:space="preserve"> </w:t>
+      </w:r>
+    </w:p>
+    <w:p>
+      <w:pPr>
+        <w:spacing w:after="0"/>
+      </w:pPr>
+    </w:p>
+    <w:p>
+      <w:pPr>
+        <w:spacing w:after="0"/>
+      </w:pPr>
+      <w:r>
+        <w:t xml:space="preserve">Choosing r = 0.999 for msdft and msdft_dc the absoulute values respects the unitary circle:</w:t>
+      </w:r>
+    </w:p>
+    <w:p>
+      <w:pPr>
+        <w:spacing w:after="0"/>
+      </w:pPr>
+      <w:r>
+        <w:drawing>
+          <wp:inline distT="0" distB="0" distL="0" distR="0">
+            <wp:extent cx="3971925" cy="4400550"/>
+            <wp:effectExtent l="0" t="0" r="0" b="0"/>
+            <wp:docPr id="6" name="Picture 6" descr=""/>
+            <wp:cNvGraphicFramePr/>
+            <a:graphic>
+              <a:graphicData uri="http://schemas.openxmlformats.org/drawingml/2006/picture">
+                <pic:pic>
+                  <pic:nvPicPr>
+                    <pic:cNvPr id="0" name="image16.png" descr=""/>
+                    <pic:cNvPicPr>
+                      <a:picLocks noChangeAspect="1" noChangeArrowheads="1"/>
+                    </pic:cNvPicPr>
+                  </pic:nvPicPr>
+                  <pic:blipFill>
+                    <a:blip r:embed="rId6"/>
+                    <a:stretch>
+                      <a:fillRect/>
+                    </a:stretch>
+                  </pic:blipFill>
+                  <pic:spPr bwMode="auto">
+                    <a:xfrm>
+                      <a:off x="0" y="0"/>
+                      <a:ext cx="3971925" cy="4400550"/>
+                    </a:xfrm>
+                    <a:prstGeom prst="rect">
+                      <a:avLst/>
+                    </a:prstGeom>
+                  </pic:spPr>
+                </pic:pic>
+              </a:graphicData>
+            </a:graphic>
+          </wp:inline>
+        </w:drawing>
+      </w:r>
+    </w:p>
+    <w:p>
+      <w:pPr>
+        <w:spacing w:after="0"/>
+      </w:pPr>
+    </w:p>
+    <w:p>
+      <w:pPr>
+        <w:spacing w:after="0"/>
+      </w:pPr>
+    </w:p>
+    <w:p>
+      <w:pPr>
+        <w:spacing w:after="0"/>
+      </w:pPr>
+    </w:p>
+    <w:p>
+      <w:pPr>
+        <w:spacing w:after="0"/>
+      </w:pPr>
+    </w:p>
+    <w:p>
+      <w:pPr>
+        <w:spacing w:after="0"/>
+      </w:pPr>
+    </w:p>
+    <w:p>
+      <w:pPr>
+        <w:spacing w:after="0"/>
+      </w:pPr>
+    </w:p>
+    <w:p>
+      <w:pPr>
+        <w:spacing w:after="0"/>
+      </w:pPr>
+    </w:p>
+    <w:p>
+      <w:pPr>
+        <w:spacing w:after="0"/>
+      </w:pPr>
+    </w:p>
+    <w:p>
+      <w:pPr>
+        <w:spacing w:after="0"/>
+      </w:pPr>
+    </w:p>
+    <w:p>
+      <w:pPr>
+        <w:spacing w:after="0"/>
+      </w:pPr>
+    </w:p>
+    <w:p>
+      <w:pPr>
+        <w:spacing w:after="0"/>
+      </w:pPr>
+    </w:p>
+    <w:p>
+      <w:pPr>
+        <w:spacing w:after="0"/>
+      </w:pPr>
+    </w:p>
+    <w:p>
+      <w:pPr>
+        <w:spacing w:after="0"/>
+      </w:pPr>
+    </w:p>
+    <w:p>
+      <w:pPr>
+        <w:spacing w:after="0"/>
+      </w:pPr>
+    </w:p>
+    <w:p>
+      <w:pPr>
+        <w:spacing w:after="0"/>
+      </w:pPr>
+    </w:p>
+    <w:p>
+      <w:pPr>
+        <w:spacing w:after="0"/>
+      </w:pPr>
+    </w:p>
+    <w:p>
+      <w:pPr>
+        <w:spacing w:after="0"/>
+      </w:pPr>
+    </w:p>
+    <w:p>
+      <w:pPr>
+        <w:spacing w:after="0"/>
+      </w:pPr>
+    </w:p>
+    <w:p>
+      <w:pPr>
+        <w:spacing w:after="0"/>
+      </w:pPr>
+    </w:p>
+    <w:p>
+      <w:pPr>
+        <w:spacing w:after="0"/>
+      </w:pPr>
+    </w:p>
+    <w:p>
+      <w:pPr>
+        <w:spacing w:after="0"/>
+      </w:pPr>
+    </w:p>
+    <w:p>
+      <w:pPr>
+        <w:spacing w:after="0"/>
+        <w:rPr>
+          <w:b/>
+          <w:bCs/>
+        </w:rPr>
+      </w:pPr>
+      <w:r>
+        <w:rPr>
+          <w:b/>
+          <w:bCs/>
+        </w:rPr>
         <w:t xml:space="preserve">24/10/2026</w:t>
       </w:r>
     </w:p>
@@ -101,7 +718,7 @@
           <wp:inline distT="0" distB="0" distL="0" distR="0">
             <wp:extent cx="5731510" cy="3416369"/>
             <wp:effectExtent l="0" t="0" r="0" b="0"/>
-            <wp:docPr id="1" name="Picture 1" descr=""/>
+            <wp:docPr id="7" name="Picture 7" descr=""/>
             <wp:cNvGraphicFramePr/>
             <a:graphic>
               <a:graphicData uri="http://schemas.openxmlformats.org/drawingml/2006/picture">
@@ -113,7 +730,7 @@
                     </pic:cNvPicPr>
                   </pic:nvPicPr>
                   <pic:blipFill>
-                    <a:blip r:embed="rId1"/>
+                    <a:blip r:embed="rId7"/>
                     <a:stretch>
                       <a:fillRect/>
                     </a:stretch>
@@ -174,7 +791,7 @@
           <wp:inline distT="0" distB="0" distL="0" distR="0">
             <wp:extent cx="5731510" cy="3422486"/>
             <wp:effectExtent l="0" t="0" r="0" b="0"/>
-            <wp:docPr id="2" name="Picture 2" descr=""/>
+            <wp:docPr id="8" name="Picture 8" descr=""/>
             <wp:cNvGraphicFramePr/>
             <a:graphic>
               <a:graphicData uri="http://schemas.openxmlformats.org/drawingml/2006/picture">
@@ -186,7 +803,7 @@
                     </pic:cNvPicPr>
                   </pic:nvPicPr>
                   <pic:blipFill>
-                    <a:blip r:embed="rId2"/>
+                    <a:blip r:embed="rId8"/>
                     <a:stretch>
                       <a:fillRect/>
                     </a:stretch>
@@ -263,7 +880,7 @@
           <wp:inline distT="0" distB="0" distL="0" distR="0">
             <wp:extent cx="5731510" cy="3399096"/>
             <wp:effectExtent l="0" t="0" r="0" b="0"/>
-            <wp:docPr id="3" name="Picture 3" descr=""/>
+            <wp:docPr id="9" name="Picture 9" descr=""/>
             <wp:cNvGraphicFramePr/>
             <a:graphic>
               <a:graphicData uri="http://schemas.openxmlformats.org/drawingml/2006/picture">
@@ -275,7 +892,7 @@
                     </pic:cNvPicPr>
                   </pic:nvPicPr>
                   <pic:blipFill>
-                    <a:blip r:embed="rId3"/>
+                    <a:blip r:embed="rId9"/>
                     <a:stretch>
                       <a:fillRect/>
                     </a:stretch>
@@ -493,7 +1110,7 @@
             <wp:extent cx="12700" cy="12700"/>
             <wp:effectExtent l="0" t="0" r="0" b="0"/>
             <wp:wrapNone/>
-            <wp:docPr id="4" name="Ink Pencil 4 #6" descr=""/>
+            <wp:docPr id="10" name="Ink Pencil 10 #6" descr=""/>
             <wp:cNvGraphicFramePr/>
             <a:graphic>
               <a:graphicData uri="http://schemas.microsoft.com/office/word/2010/wordprocessingShape">
@@ -569,7 +1186,7 @@
           <wp:inline distT="0" distB="0" distL="0" distR="0">
             <wp:extent cx="5731256" cy="1959110"/>
             <wp:effectExtent l="0" t="0" r="0" b="0"/>
-            <wp:docPr id="5" name="Picture 5" descr=""/>
+            <wp:docPr id="11" name="Picture 11" descr=""/>
             <wp:cNvGraphicFramePr/>
             <a:graphic>
               <a:graphicData uri="http://schemas.openxmlformats.org/drawingml/2006/picture">
@@ -581,7 +1198,7 @@
                     </pic:cNvPicPr>
                   </pic:nvPicPr>
                   <pic:blipFill>
-                    <a:blip r:embed="rId4"/>
+                    <a:blip r:embed="rId10"/>
                     <a:stretch>
                       <a:fillRect/>
                     </a:stretch>
@@ -620,7 +1237,7 @@
           <wp:inline distT="0" distB="0" distL="0" distR="0">
             <wp:extent cx="5731256" cy="4743663"/>
             <wp:effectExtent l="0" t="0" r="0" b="0"/>
-            <wp:docPr id="6" name="Picture 6" descr=""/>
+            <wp:docPr id="12" name="Picture 12" descr=""/>
             <wp:cNvGraphicFramePr/>
             <a:graphic>
               <a:graphicData uri="http://schemas.openxmlformats.org/drawingml/2006/picture">
@@ -632,7 +1249,7 @@
                     </pic:cNvPicPr>
                   </pic:nvPicPr>
                   <pic:blipFill>
-                    <a:blip r:embed="rId5"/>
+                    <a:blip r:embed="rId11"/>
                     <a:stretch>
                       <a:fillRect/>
                     </a:stretch>
@@ -676,7 +1293,7 @@
           <wp:inline distT="0" distB="0" distL="0" distR="0">
             <wp:extent cx="5731256" cy="1979574"/>
             <wp:effectExtent l="0" t="0" r="0" b="0"/>
-            <wp:docPr id="7" name="Picture 7" descr=""/>
+            <wp:docPr id="13" name="Picture 13" descr=""/>
             <wp:cNvGraphicFramePr/>
             <a:graphic>
               <a:graphicData uri="http://schemas.openxmlformats.org/drawingml/2006/picture">
@@ -688,7 +1305,7 @@
                     </pic:cNvPicPr>
                   </pic:nvPicPr>
                   <pic:blipFill>
-                    <a:blip r:embed="rId6"/>
+                    <a:blip r:embed="rId12"/>
                     <a:stretch>
                       <a:fillRect/>
                     </a:stretch>
@@ -713,7 +1330,7 @@
           <wp:inline distT="0" distB="0" distL="0" distR="0">
             <wp:extent cx="5288424" cy="4377138"/>
             <wp:effectExtent l="0" t="0" r="0" b="0"/>
-            <wp:docPr id="8" name="Picture 8" descr=""/>
+            <wp:docPr id="14" name="Picture 14" descr=""/>
             <wp:cNvGraphicFramePr/>
             <a:graphic>
               <a:graphicData uri="http://schemas.openxmlformats.org/drawingml/2006/picture">
@@ -725,7 +1342,7 @@
                     </pic:cNvPicPr>
                   </pic:nvPicPr>
                   <pic:blipFill>
-                    <a:blip r:embed="rId7"/>
+                    <a:blip r:embed="rId13"/>
                     <a:stretch>
                       <a:fillRect/>
                     </a:stretch>
@@ -820,7 +1437,7 @@
             <wp:extent cx="12700" cy="12700"/>
             <wp:effectExtent l="0" t="0" r="0" b="0"/>
             <wp:wrapNone/>
-            <wp:docPr id="9" name="Ink Pen 9 #5" descr=""/>
+            <wp:docPr id="15" name="Ink Pen 15 #5" descr=""/>
             <wp:cNvGraphicFramePr/>
             <a:graphic>
               <a:graphicData uri="http://schemas.microsoft.com/office/word/2010/wordprocessingShape">
@@ -868,7 +1485,7 @@
           <wp:inline distT="0" distB="0" distL="0" distR="0">
             <wp:extent cx="5731256" cy="1982239"/>
             <wp:effectExtent l="0" t="0" r="0" b="0"/>
-            <wp:docPr id="10" name="Picture 10" descr=""/>
+            <wp:docPr id="16" name="Picture 16" descr=""/>
             <wp:cNvGraphicFramePr/>
             <a:graphic>
               <a:graphicData uri="http://schemas.openxmlformats.org/drawingml/2006/picture">
@@ -880,7 +1497,7 @@
                     </pic:cNvPicPr>
                   </pic:nvPicPr>
                   <pic:blipFill>
-                    <a:blip r:embed="rId8"/>
+                    <a:blip r:embed="rId14"/>
                     <a:stretch>
                       <a:fillRect/>
                     </a:stretch>
@@ -928,7 +1545,7 @@
             <wp:extent cx="12700" cy="12700"/>
             <wp:effectExtent l="0" t="0" r="0" b="0"/>
             <wp:wrapNone/>
-            <wp:docPr id="11" name="Ink Pen 11 #3" descr=""/>
+            <wp:docPr id="17" name="Ink Pen 17 #3" descr=""/>
             <wp:cNvGraphicFramePr/>
             <a:graphic>
               <a:graphicData uri="http://schemas.microsoft.com/office/word/2010/wordprocessingShape">
@@ -987,7 +1604,7 @@
             <wp:extent cx="12700" cy="12700"/>
             <wp:effectExtent l="0" t="0" r="0" b="0"/>
             <wp:wrapNone/>
-            <wp:docPr id="12" name="Ink Pen 12 #2" descr=""/>
+            <wp:docPr id="18" name="Ink Pen 18 #2" descr=""/>
             <wp:cNvGraphicFramePr/>
             <a:graphic>
               <a:graphicData uri="http://schemas.microsoft.com/office/word/2010/wordprocessingShape">
@@ -1046,7 +1663,7 @@
             <wp:extent cx="754562" cy="1159843"/>
             <wp:effectExtent l="0" t="0" r="0" b="0"/>
             <wp:wrapNone/>
-            <wp:docPr id="13" name="Ink Pen 13 #1" descr=""/>
+            <wp:docPr id="19" name="Ink Pen 19 #1" descr=""/>
             <wp:cNvGraphicFramePr/>
             <a:graphic>
               <a:graphicData uri="http://schemas.microsoft.com/office/word/2010/wordprocessingShape">
@@ -1463,7 +2080,7 @@
           <wp:inline distT="0" distB="0" distL="0" distR="0">
             <wp:extent cx="5731256" cy="4743663"/>
             <wp:effectExtent l="0" t="0" r="0" b="0"/>
-            <wp:docPr id="14" name="Picture 14" descr=""/>
+            <wp:docPr id="20" name="Picture 20" descr=""/>
             <wp:cNvGraphicFramePr/>
             <a:graphic>
               <a:graphicData uri="http://schemas.openxmlformats.org/drawingml/2006/picture">
@@ -1475,7 +2092,7 @@
                     </pic:cNvPicPr>
                   </pic:nvPicPr>
                   <pic:blipFill>
-                    <a:blip r:embed="rId9"/>
+                    <a:blip r:embed="rId15"/>
                     <a:stretch>
                       <a:fillRect/>
                     </a:stretch>
@@ -1536,7 +2153,7 @@
           <wp:inline distT="0" distB="0" distL="0" distR="0">
             <wp:extent cx="4714875" cy="3667125"/>
             <wp:effectExtent l="0" t="0" r="0" b="0"/>
-            <wp:docPr id="15" name="Picture 15" descr=""/>
+            <wp:docPr id="21" name="Picture 21" descr=""/>
             <wp:cNvGraphicFramePr/>
             <a:graphic>
               <a:graphicData uri="http://schemas.openxmlformats.org/drawingml/2006/picture">
@@ -1548,7 +2165,7 @@
                     </pic:cNvPicPr>
                   </pic:nvPicPr>
                   <pic:blipFill>
-                    <a:blip r:embed="rId10"/>
+                    <a:blip r:embed="rId16"/>
                     <a:stretch>
                       <a:fillRect/>
                     </a:stretch>

</xml_diff>

<commit_message>
update: new version of code, imlpemented one function for each algoritm
</commit_message>
<xml_diff>
--- a/History_report.docx
+++ b/History_report.docx
@@ -74,6 +74,97 @@
           <w:b/>
           <w:bCs/>
         </w:rPr>
+        <w:t xml:space="preserve">23:20 </w:t>
+      </w:r>
+      <w:r>
+        <w:rPr>
+          <w:b w:val="0"/>
+          <w:bCs w:val="0"/>
+        </w:rPr>
+        <w:t xml:space="preserve">Developing one function for each algorithm</w:t>
+      </w:r>
+    </w:p>
+    <w:p>
+      <w:pPr>
+        <w:spacing w:after="0"/>
+        <w:rPr>
+          <w:b w:val="0"/>
+          <w:bCs w:val="0"/>
+        </w:rPr>
+      </w:pPr>
+      <w:r>
+        <w:rPr>
+          <w:b w:val="0"/>
+          <w:bCs w:val="0"/>
+        </w:rPr>
+        <w:drawing>
+          <wp:inline distT="0" distB="0" distL="0" distR="0">
+            <wp:extent cx="5731510" cy="3809228"/>
+            <wp:effectExtent l="0" t="0" r="0" b="0"/>
+            <wp:docPr id="1" name="Picture 1" descr=""/>
+            <wp:cNvGraphicFramePr/>
+            <a:graphic>
+              <a:graphicData uri="http://schemas.openxmlformats.org/drawingml/2006/picture">
+                <pic:pic>
+                  <pic:nvPicPr>
+                    <pic:cNvPr id="0" name="image20.png" descr=""/>
+                    <pic:cNvPicPr>
+                      <a:picLocks noChangeAspect="1" noChangeArrowheads="1"/>
+                    </pic:cNvPicPr>
+                  </pic:nvPicPr>
+                  <pic:blipFill>
+                    <a:blip r:embed="rId1"/>
+                    <a:stretch>
+                      <a:fillRect/>
+                    </a:stretch>
+                  </pic:blipFill>
+                  <pic:spPr bwMode="auto">
+                    <a:xfrm>
+                      <a:off x="0" y="0"/>
+                      <a:ext cx="5731510" cy="3809228"/>
+                    </a:xfrm>
+                    <a:prstGeom prst="rect">
+                      <a:avLst/>
+                    </a:prstGeom>
+                  </pic:spPr>
+                </pic:pic>
+              </a:graphicData>
+            </a:graphic>
+          </wp:inline>
+        </w:drawing>
+      </w:r>
+    </w:p>
+    <w:p>
+      <w:pPr>
+        <w:spacing w:after="0"/>
+        <w:rPr>
+          <w:b w:val="0"/>
+          <w:bCs w:val="0"/>
+        </w:rPr>
+      </w:pPr>
+    </w:p>
+    <w:p>
+      <w:pPr>
+        <w:spacing w:after="0"/>
+        <w:rPr>
+          <w:b w:val="0"/>
+          <w:bCs w:val="0"/>
+        </w:rPr>
+      </w:pPr>
+    </w:p>
+    <w:p>
+      <w:pPr>
+        <w:spacing w:after="0"/>
+        <w:rPr>
+          <w:b/>
+          <w:bCs/>
+        </w:rPr>
+      </w:pPr>
+      <w:r>
+        <w:rPr>
+          <w:b/>
+          <w:bCs/>
+        </w:rPr>
         <w:t xml:space="preserve">21:51 </w:t>
       </w:r>
       <w:r>
@@ -101,7 +192,7 @@
           <wp:inline distT="0" distB="0" distL="0" distR="0">
             <wp:extent cx="5731510" cy="1103846"/>
             <wp:effectExtent l="0" t="0" r="0" b="0"/>
-            <wp:docPr id="1" name="Picture 1" descr=""/>
+            <wp:docPr id="2" name="Picture 2" descr=""/>
             <wp:cNvGraphicFramePr/>
             <a:graphic>
               <a:graphicData uri="http://schemas.openxmlformats.org/drawingml/2006/picture">
@@ -113,7 +204,7 @@
                     </pic:cNvPicPr>
                   </pic:nvPicPr>
                   <pic:blipFill>
-                    <a:blip r:embed="rId1"/>
+                    <a:blip r:embed="rId2"/>
                     <a:stretch>
                       <a:fillRect/>
                     </a:stretch>
@@ -151,7 +242,7 @@
           <wp:inline distT="0" distB="0" distL="0" distR="0">
             <wp:extent cx="4638675" cy="1428750"/>
             <wp:effectExtent l="0" t="0" r="0" b="0"/>
-            <wp:docPr id="2" name="Picture 2" descr=""/>
+            <wp:docPr id="3" name="Picture 3" descr=""/>
             <wp:cNvGraphicFramePr/>
             <a:graphic>
               <a:graphicData uri="http://schemas.openxmlformats.org/drawingml/2006/picture">
@@ -163,7 +254,7 @@
                     </pic:cNvPicPr>
                   </pic:nvPicPr>
                   <pic:blipFill>
-                    <a:blip r:embed="rId2"/>
+                    <a:blip r:embed="rId3"/>
                     <a:stretch>
                       <a:fillRect/>
                     </a:stretch>
@@ -201,7 +292,7 @@
           <wp:inline distT="0" distB="0" distL="0" distR="0">
             <wp:extent cx="5438775" cy="1381125"/>
             <wp:effectExtent l="0" t="0" r="0" b="0"/>
-            <wp:docPr id="3" name="Picture 3" descr=""/>
+            <wp:docPr id="4" name="Picture 4" descr=""/>
             <wp:cNvGraphicFramePr/>
             <a:graphic>
               <a:graphicData uri="http://schemas.openxmlformats.org/drawingml/2006/picture">
@@ -213,7 +304,7 @@
                     </pic:cNvPicPr>
                   </pic:nvPicPr>
                   <pic:blipFill>
-                    <a:blip r:embed="rId3"/>
+                    <a:blip r:embed="rId4"/>
                     <a:stretch>
                       <a:fillRect/>
                     </a:stretch>
@@ -251,7 +342,7 @@
           <wp:inline distT="0" distB="0" distL="0" distR="0">
             <wp:extent cx="5731510" cy="1083024"/>
             <wp:effectExtent l="0" t="0" r="0" b="0"/>
-            <wp:docPr id="4" name="Picture 4" descr=""/>
+            <wp:docPr id="5" name="Picture 5" descr=""/>
             <wp:cNvGraphicFramePr/>
             <a:graphic>
               <a:graphicData uri="http://schemas.openxmlformats.org/drawingml/2006/picture">
@@ -263,7 +354,7 @@
                     </pic:cNvPicPr>
                   </pic:nvPicPr>
                   <pic:blipFill>
-                    <a:blip r:embed="rId4"/>
+                    <a:blip r:embed="rId5"/>
                     <a:stretch>
                       <a:fillRect/>
                     </a:stretch>
@@ -462,7 +553,7 @@
           <wp:inline distT="0" distB="0" distL="0" distR="0">
             <wp:extent cx="2487274" cy="5928370"/>
             <wp:effectExtent l="0" t="0" r="0" b="0"/>
-            <wp:docPr id="5" name="Picture 5" descr=""/>
+            <wp:docPr id="6" name="Picture 6" descr=""/>
             <wp:cNvGraphicFramePr/>
             <a:graphic>
               <a:graphicData uri="http://schemas.openxmlformats.org/drawingml/2006/picture">
@@ -474,7 +565,7 @@
                     </pic:cNvPicPr>
                   </pic:nvPicPr>
                   <pic:blipFill>
-                    <a:blip r:embed="rId5"/>
+                    <a:blip r:embed="rId6"/>
                     <a:stretch>
                       <a:fillRect/>
                     </a:stretch>
@@ -524,7 +615,7 @@
           <wp:inline distT="0" distB="0" distL="0" distR="0">
             <wp:extent cx="3971925" cy="4400550"/>
             <wp:effectExtent l="0" t="0" r="0" b="0"/>
-            <wp:docPr id="6" name="Picture 6" descr=""/>
+            <wp:docPr id="7" name="Picture 7" descr=""/>
             <wp:cNvGraphicFramePr/>
             <a:graphic>
               <a:graphicData uri="http://schemas.openxmlformats.org/drawingml/2006/picture">
@@ -536,7 +627,7 @@
                     </pic:cNvPicPr>
                   </pic:nvPicPr>
                   <pic:blipFill>
-                    <a:blip r:embed="rId6"/>
+                    <a:blip r:embed="rId7"/>
                     <a:stretch>
                       <a:fillRect/>
                     </a:stretch>
@@ -718,7 +809,7 @@
           <wp:inline distT="0" distB="0" distL="0" distR="0">
             <wp:extent cx="5731510" cy="3416369"/>
             <wp:effectExtent l="0" t="0" r="0" b="0"/>
-            <wp:docPr id="7" name="Picture 7" descr=""/>
+            <wp:docPr id="8" name="Picture 8" descr=""/>
             <wp:cNvGraphicFramePr/>
             <a:graphic>
               <a:graphicData uri="http://schemas.openxmlformats.org/drawingml/2006/picture">
@@ -730,7 +821,7 @@
                     </pic:cNvPicPr>
                   </pic:nvPicPr>
                   <pic:blipFill>
-                    <a:blip r:embed="rId7"/>
+                    <a:blip r:embed="rId8"/>
                     <a:stretch>
                       <a:fillRect/>
                     </a:stretch>
@@ -791,7 +882,7 @@
           <wp:inline distT="0" distB="0" distL="0" distR="0">
             <wp:extent cx="5731510" cy="3422486"/>
             <wp:effectExtent l="0" t="0" r="0" b="0"/>
-            <wp:docPr id="8" name="Picture 8" descr=""/>
+            <wp:docPr id="9" name="Picture 9" descr=""/>
             <wp:cNvGraphicFramePr/>
             <a:graphic>
               <a:graphicData uri="http://schemas.openxmlformats.org/drawingml/2006/picture">
@@ -803,7 +894,7 @@
                     </pic:cNvPicPr>
                   </pic:nvPicPr>
                   <pic:blipFill>
-                    <a:blip r:embed="rId8"/>
+                    <a:blip r:embed="rId9"/>
                     <a:stretch>
                       <a:fillRect/>
                     </a:stretch>
@@ -880,7 +971,7 @@
           <wp:inline distT="0" distB="0" distL="0" distR="0">
             <wp:extent cx="5731510" cy="3399096"/>
             <wp:effectExtent l="0" t="0" r="0" b="0"/>
-            <wp:docPr id="9" name="Picture 9" descr=""/>
+            <wp:docPr id="10" name="Picture 10" descr=""/>
             <wp:cNvGraphicFramePr/>
             <a:graphic>
               <a:graphicData uri="http://schemas.openxmlformats.org/drawingml/2006/picture">
@@ -892,7 +983,7 @@
                     </pic:cNvPicPr>
                   </pic:nvPicPr>
                   <pic:blipFill>
-                    <a:blip r:embed="rId9"/>
+                    <a:blip r:embed="rId10"/>
                     <a:stretch>
                       <a:fillRect/>
                     </a:stretch>
@@ -1110,7 +1201,7 @@
             <wp:extent cx="12700" cy="12700"/>
             <wp:effectExtent l="0" t="0" r="0" b="0"/>
             <wp:wrapNone/>
-            <wp:docPr id="10" name="Ink Pencil 10 #6" descr=""/>
+            <wp:docPr id="11" name="Ink Pencil 11 #6" descr=""/>
             <wp:cNvGraphicFramePr/>
             <a:graphic>
               <a:graphicData uri="http://schemas.microsoft.com/office/word/2010/wordprocessingShape">
@@ -1186,7 +1277,7 @@
           <wp:inline distT="0" distB="0" distL="0" distR="0">
             <wp:extent cx="5731256" cy="1959110"/>
             <wp:effectExtent l="0" t="0" r="0" b="0"/>
-            <wp:docPr id="11" name="Picture 11" descr=""/>
+            <wp:docPr id="12" name="Picture 12" descr=""/>
             <wp:cNvGraphicFramePr/>
             <a:graphic>
               <a:graphicData uri="http://schemas.openxmlformats.org/drawingml/2006/picture">
@@ -1198,7 +1289,7 @@
                     </pic:cNvPicPr>
                   </pic:nvPicPr>
                   <pic:blipFill>
-                    <a:blip r:embed="rId10"/>
+                    <a:blip r:embed="rId11"/>
                     <a:stretch>
                       <a:fillRect/>
                     </a:stretch>
@@ -1237,7 +1328,7 @@
           <wp:inline distT="0" distB="0" distL="0" distR="0">
             <wp:extent cx="5731256" cy="4743663"/>
             <wp:effectExtent l="0" t="0" r="0" b="0"/>
-            <wp:docPr id="12" name="Picture 12" descr=""/>
+            <wp:docPr id="13" name="Picture 13" descr=""/>
             <wp:cNvGraphicFramePr/>
             <a:graphic>
               <a:graphicData uri="http://schemas.openxmlformats.org/drawingml/2006/picture">
@@ -1249,7 +1340,7 @@
                     </pic:cNvPicPr>
                   </pic:nvPicPr>
                   <pic:blipFill>
-                    <a:blip r:embed="rId11"/>
+                    <a:blip r:embed="rId12"/>
                     <a:stretch>
                       <a:fillRect/>
                     </a:stretch>
@@ -1293,7 +1384,7 @@
           <wp:inline distT="0" distB="0" distL="0" distR="0">
             <wp:extent cx="5731256" cy="1979574"/>
             <wp:effectExtent l="0" t="0" r="0" b="0"/>
-            <wp:docPr id="13" name="Picture 13" descr=""/>
+            <wp:docPr id="14" name="Picture 14" descr=""/>
             <wp:cNvGraphicFramePr/>
             <a:graphic>
               <a:graphicData uri="http://schemas.openxmlformats.org/drawingml/2006/picture">
@@ -1305,7 +1396,7 @@
                     </pic:cNvPicPr>
                   </pic:nvPicPr>
                   <pic:blipFill>
-                    <a:blip r:embed="rId12"/>
+                    <a:blip r:embed="rId13"/>
                     <a:stretch>
                       <a:fillRect/>
                     </a:stretch>
@@ -1330,7 +1421,7 @@
           <wp:inline distT="0" distB="0" distL="0" distR="0">
             <wp:extent cx="5288424" cy="4377138"/>
             <wp:effectExtent l="0" t="0" r="0" b="0"/>
-            <wp:docPr id="14" name="Picture 14" descr=""/>
+            <wp:docPr id="15" name="Picture 15" descr=""/>
             <wp:cNvGraphicFramePr/>
             <a:graphic>
               <a:graphicData uri="http://schemas.openxmlformats.org/drawingml/2006/picture">
@@ -1342,7 +1433,7 @@
                     </pic:cNvPicPr>
                   </pic:nvPicPr>
                   <pic:blipFill>
-                    <a:blip r:embed="rId13"/>
+                    <a:blip r:embed="rId14"/>
                     <a:stretch>
                       <a:fillRect/>
                     </a:stretch>
@@ -1437,7 +1528,7 @@
             <wp:extent cx="12700" cy="12700"/>
             <wp:effectExtent l="0" t="0" r="0" b="0"/>
             <wp:wrapNone/>
-            <wp:docPr id="15" name="Ink Pen 15 #5" descr=""/>
+            <wp:docPr id="16" name="Ink Pen 16 #5" descr=""/>
             <wp:cNvGraphicFramePr/>
             <a:graphic>
               <a:graphicData uri="http://schemas.microsoft.com/office/word/2010/wordprocessingShape">
@@ -1485,7 +1576,7 @@
           <wp:inline distT="0" distB="0" distL="0" distR="0">
             <wp:extent cx="5731256" cy="1982239"/>
             <wp:effectExtent l="0" t="0" r="0" b="0"/>
-            <wp:docPr id="16" name="Picture 16" descr=""/>
+            <wp:docPr id="17" name="Picture 17" descr=""/>
             <wp:cNvGraphicFramePr/>
             <a:graphic>
               <a:graphicData uri="http://schemas.openxmlformats.org/drawingml/2006/picture">
@@ -1497,7 +1588,7 @@
                     </pic:cNvPicPr>
                   </pic:nvPicPr>
                   <pic:blipFill>
-                    <a:blip r:embed="rId14"/>
+                    <a:blip r:embed="rId15"/>
                     <a:stretch>
                       <a:fillRect/>
                     </a:stretch>
@@ -1545,7 +1636,7 @@
             <wp:extent cx="12700" cy="12700"/>
             <wp:effectExtent l="0" t="0" r="0" b="0"/>
             <wp:wrapNone/>
-            <wp:docPr id="17" name="Ink Pen 17 #3" descr=""/>
+            <wp:docPr id="18" name="Ink Pen 18 #3" descr=""/>
             <wp:cNvGraphicFramePr/>
             <a:graphic>
               <a:graphicData uri="http://schemas.microsoft.com/office/word/2010/wordprocessingShape">
@@ -1604,7 +1695,7 @@
             <wp:extent cx="12700" cy="12700"/>
             <wp:effectExtent l="0" t="0" r="0" b="0"/>
             <wp:wrapNone/>
-            <wp:docPr id="18" name="Ink Pen 18 #2" descr=""/>
+            <wp:docPr id="19" name="Ink Pen 19 #2" descr=""/>
             <wp:cNvGraphicFramePr/>
             <a:graphic>
               <a:graphicData uri="http://schemas.microsoft.com/office/word/2010/wordprocessingShape">
@@ -1663,7 +1754,7 @@
             <wp:extent cx="754562" cy="1159843"/>
             <wp:effectExtent l="0" t="0" r="0" b="0"/>
             <wp:wrapNone/>
-            <wp:docPr id="19" name="Ink Pen 19 #1" descr=""/>
+            <wp:docPr id="20" name="Ink Pen 20 #1" descr=""/>
             <wp:cNvGraphicFramePr/>
             <a:graphic>
               <a:graphicData uri="http://schemas.microsoft.com/office/word/2010/wordprocessingShape">
@@ -2080,7 +2171,7 @@
           <wp:inline distT="0" distB="0" distL="0" distR="0">
             <wp:extent cx="5731256" cy="4743663"/>
             <wp:effectExtent l="0" t="0" r="0" b="0"/>
-            <wp:docPr id="20" name="Picture 20" descr=""/>
+            <wp:docPr id="21" name="Picture 21" descr=""/>
             <wp:cNvGraphicFramePr/>
             <a:graphic>
               <a:graphicData uri="http://schemas.openxmlformats.org/drawingml/2006/picture">
@@ -2092,7 +2183,7 @@
                     </pic:cNvPicPr>
                   </pic:nvPicPr>
                   <pic:blipFill>
-                    <a:blip r:embed="rId15"/>
+                    <a:blip r:embed="rId16"/>
                     <a:stretch>
                       <a:fillRect/>
                     </a:stretch>
@@ -2153,7 +2244,7 @@
           <wp:inline distT="0" distB="0" distL="0" distR="0">
             <wp:extent cx="4714875" cy="3667125"/>
             <wp:effectExtent l="0" t="0" r="0" b="0"/>
-            <wp:docPr id="21" name="Picture 21" descr=""/>
+            <wp:docPr id="22" name="Picture 22" descr=""/>
             <wp:cNvGraphicFramePr/>
             <a:graphic>
               <a:graphicData uri="http://schemas.openxmlformats.org/drawingml/2006/picture">
@@ -2165,7 +2256,7 @@
                     </pic:cNvPicPr>
                   </pic:nvPicPr>
                   <pic:blipFill>
-                    <a:blip r:embed="rId16"/>
+                    <a:blip r:embed="rId17"/>
                     <a:stretch>
                       <a:fillRect/>
                     </a:stretch>

</xml_diff>